<commit_message>
Added a script to extra individual charcters from the document
</commit_message>
<xml_diff>
--- a/TestFiles/L1VocabCon.docx
+++ b/TestFiles/L1VocabCon.docx
@@ -76,16 +76,24 @@
           <w:sz w:val="28"/>
           <w:szCs w:val="28"/>
         </w:rPr>
-        <w:t>你，</w:t>
+        <w:t>请问，</w:t>
       </w:r>
       <w:proofErr w:type="spellStart"/>
       <w:r>
         <w:rPr>
-          <w:rFonts w:ascii="Times New Roman" w:eastAsia="SimSun" w:hAnsi="Times New Roman" w:cs="Times New Roman"/>
-          <w:sz w:val="28"/>
-          <w:szCs w:val="28"/>
-        </w:rPr>
-        <w:t>nǐ</w:t>
+          <w:rFonts w:ascii="Times New Roman" w:eastAsia="SimSun" w:hAnsi="Times New Roman" w:cs="Times New Roman" w:hint="eastAsia"/>
+          <w:sz w:val="28"/>
+          <w:szCs w:val="28"/>
+        </w:rPr>
+        <w:t>q</w:t>
+      </w:r>
+      <w:r>
+        <w:rPr>
+          <w:rFonts w:ascii="Times New Roman" w:eastAsia="SimSun" w:hAnsi="Times New Roman" w:cs="Times New Roman"/>
+          <w:sz w:val="28"/>
+          <w:szCs w:val="28"/>
+        </w:rPr>
+        <w:t>ǐngwèn</w:t>
       </w:r>
       <w:proofErr w:type="spellEnd"/>
       <w:r>
@@ -94,7 +102,7 @@
           <w:sz w:val="28"/>
           <w:szCs w:val="28"/>
         </w:rPr>
-        <w:t>: you (singular pronoun)</w:t>
+        <w:t>: may I ask</w:t>
       </w:r>
     </w:p>
     <w:p>
@@ -180,23 +188,41 @@
           <w:sz w:val="28"/>
           <w:szCs w:val="28"/>
         </w:rPr>
-        <w:t>吗，</w:t>
-      </w:r>
-      <w:r>
-        <w:rPr>
-          <w:rFonts w:ascii="Times New Roman" w:eastAsia="SimSun" w:hAnsi="Times New Roman" w:cs="Times New Roman"/>
-          <w:sz w:val="28"/>
-          <w:szCs w:val="28"/>
-        </w:rPr>
-        <w:t>ma: a question particle</w:t>
-      </w:r>
-      <w:r>
-        <w:rPr>
-          <w:rFonts w:ascii="Times New Roman" w:eastAsia="SimSun" w:hAnsi="Times New Roman" w:cs="Times New Roman" w:hint="eastAsia"/>
-          <w:sz w:val="28"/>
-          <w:szCs w:val="28"/>
-        </w:rPr>
-        <w:t>，你忙吗</w:t>
+        <w:t>谢谢，</w:t>
+      </w:r>
+      <w:proofErr w:type="spellStart"/>
+      <w:r>
+        <w:rPr>
+          <w:rFonts w:ascii="Times New Roman" w:eastAsia="SimSun" w:hAnsi="Times New Roman" w:cs="Times New Roman" w:hint="eastAsia"/>
+          <w:sz w:val="28"/>
+          <w:szCs w:val="28"/>
+        </w:rPr>
+        <w:t>x</w:t>
+      </w:r>
+      <w:r>
+        <w:rPr>
+          <w:rFonts w:ascii="Times New Roman" w:eastAsia="SimSun" w:hAnsi="Times New Roman" w:cs="Times New Roman"/>
+          <w:sz w:val="28"/>
+          <w:szCs w:val="28"/>
+        </w:rPr>
+        <w:t>ièxie</w:t>
+      </w:r>
+      <w:proofErr w:type="spellEnd"/>
+      <w:r>
+        <w:rPr>
+          <w:rFonts w:ascii="Times New Roman" w:eastAsia="SimSun" w:hAnsi="Times New Roman" w:cs="Times New Roman"/>
+          <w:sz w:val="28"/>
+          <w:szCs w:val="28"/>
+        </w:rPr>
+        <w:t>: to thank</w:t>
+      </w:r>
+      <w:r>
+        <w:rPr>
+          <w:rFonts w:ascii="Times New Roman" w:eastAsia="SimSun" w:hAnsi="Times New Roman" w:cs="Times New Roman" w:hint="eastAsia"/>
+          <w:sz w:val="28"/>
+          <w:szCs w:val="28"/>
+        </w:rPr>
+        <w:t>，谢谢你</w:t>
       </w:r>
     </w:p>
     <w:p>
@@ -239,16 +265,24 @@
           <w:sz w:val="28"/>
           <w:szCs w:val="28"/>
         </w:rPr>
-        <w:t>困，</w:t>
+        <w:t>马马虎虎，</w:t>
       </w:r>
       <w:proofErr w:type="spellStart"/>
       <w:r>
         <w:rPr>
-          <w:rFonts w:ascii="Times New Roman" w:eastAsia="SimSun" w:hAnsi="Times New Roman" w:cs="Times New Roman"/>
-          <w:sz w:val="28"/>
-          <w:szCs w:val="28"/>
-        </w:rPr>
-        <w:t>kùn</w:t>
+          <w:rFonts w:ascii="Times New Roman" w:eastAsia="SimSun" w:hAnsi="Times New Roman" w:cs="Times New Roman" w:hint="eastAsia"/>
+          <w:sz w:val="28"/>
+          <w:szCs w:val="28"/>
+        </w:rPr>
+        <w:t>m</w:t>
+      </w:r>
+      <w:r>
+        <w:rPr>
+          <w:rFonts w:ascii="Times New Roman" w:eastAsia="SimSun" w:hAnsi="Times New Roman" w:cs="Times New Roman"/>
+          <w:sz w:val="28"/>
+          <w:szCs w:val="28"/>
+        </w:rPr>
+        <w:t>ǎmǎhūhū</w:t>
       </w:r>
       <w:proofErr w:type="spellEnd"/>
       <w:r>
@@ -257,16 +291,18 @@
           <w:sz w:val="28"/>
           <w:szCs w:val="28"/>
         </w:rPr>
-        <w:t>: sleepy</w:t>
-      </w:r>
-      <w:r>
-        <w:rPr>
-          <w:rFonts w:ascii="Times New Roman" w:eastAsia="SimSun" w:hAnsi="Times New Roman" w:cs="Times New Roman" w:hint="eastAsia"/>
-          <w:sz w:val="28"/>
-          <w:szCs w:val="28"/>
-        </w:rPr>
-        <w:t>，很困</w:t>
-      </w:r>
+        <w:t xml:space="preserve">: so </w:t>
+      </w:r>
+      <w:proofErr w:type="spellStart"/>
+      <w:r>
+        <w:rPr>
+          <w:rFonts w:ascii="Times New Roman" w:eastAsia="SimSun" w:hAnsi="Times New Roman" w:cs="Times New Roman"/>
+          <w:sz w:val="28"/>
+          <w:szCs w:val="28"/>
+        </w:rPr>
+        <w:t>so</w:t>
+      </w:r>
+      <w:proofErr w:type="spellEnd"/>
     </w:p>
     <w:p>
       <w:pPr>
@@ -841,6 +877,7 @@
   <w:style w:type="character" w:default="1" w:styleId="DefaultParagraphFont">
     <w:name w:val="Default Paragraph Font"/>
     <w:uiPriority w:val="1"/>
+    <w:semiHidden/>
     <w:unhideWhenUsed/>
   </w:style>
   <w:style w:type="table" w:default="1" w:styleId="TableNormal">

</xml_diff>